<commit_message>
Make offline heritage workflows region-neutral nationwide
Infer collection regions and township statistics from imported records and generic addresses; remove local branding, roster, document and deployment defaults. Require explicit projection meridians and retain high-level heritage risk warnings without automatic rejection. Add migration, regression coverage and rebuilt offline UI.

Co-authored-by: Copilot <223556219+Copilot@users.noreply.github.com>
</commit_message>
<xml_diff>
--- a/template.docx
+++ b/template.docx
@@ -20,7 +20,7 @@
           <w:szCs w:val="24"/>
           <w:lang w:val="en-US" w:eastAsia="zh-CN"/>
         </w:rPr>
-        <w:t>鄯善</w:t>
+        <w:t/>
       </w:r>
       <w:r>
         <w:rPr>
@@ -30,7 +30,7 @@
           <w:sz w:val="24"/>
           <w:szCs w:val="24"/>
         </w:rPr>
-        <w:t>县不可移动文物安全巡查日志</w:t>
+        <w:t>不可移动文物安全巡查日志</w:t>
       </w:r>
     </w:p>
     <w:p>

</xml_diff>